<commit_message>
Sprints 7 y 8 corregidos
</commit_message>
<xml_diff>
--- a/Documentos Base/Sprint 7 documentacion/Sprint_07_Planificado_Realizado_ICARO.docx
+++ b/Documentos Base/Sprint 7 documentacion/Sprint_07_Planificado_Realizado_ICARO.docx
@@ -4,6 +4,7 @@
   <w:body>
     <w:p>
       <w:pPr>
+        <w:spacing w:after="0"/>
         <w:jc w:val="center"/>
       </w:pPr>
       <w:r>
@@ -18,6 +19,7 @@
     </w:p>
     <w:p>
       <w:pPr>
+        <w:spacing w:after="0"/>
         <w:jc w:val="center"/>
       </w:pPr>
       <w:r>
@@ -31,6 +33,7 @@
     </w:p>
     <w:p>
       <w:pPr>
+        <w:spacing w:after="0"/>
         <w:jc w:val="center"/>
       </w:pPr>
       <w:r>
@@ -210,15 +213,7 @@
                 <w:color w:val="000000"/>
                 <w:sz w:val="20"/>
               </w:rPr>
-              <w:t>30</w:t>
-            </w:r>
-            <w:r>
-              <w:rPr>
-                <w:rFonts w:ascii="Calibri" w:hAnsi="Calibri"/>
-                <w:color w:val="000000"/>
-                <w:sz w:val="20"/>
-              </w:rPr>
-              <w:t>/05/2026</w:t>
+              <w:t>30/05/2026</w:t>
             </w:r>
           </w:p>
         </w:tc>
@@ -448,15 +443,7 @@
                 <w:color w:val="000000"/>
                 <w:sz w:val="20"/>
               </w:rPr>
-              <w:t>30</w:t>
-            </w:r>
-            <w:r>
-              <w:rPr>
-                <w:rFonts w:ascii="Calibri" w:hAnsi="Calibri"/>
-                <w:color w:val="000000"/>
-                <w:sz w:val="20"/>
-              </w:rPr>
-              <w:t>/05/2026</w:t>
+              <w:t>30/05/2026</w:t>
             </w:r>
           </w:p>
         </w:tc>
@@ -2698,53 +2685,35 @@
                 <w:sz w:val="16"/>
                 <w:szCs w:val="16"/>
               </w:rPr>
-              <w:t>4</w:t>
-            </w:r>
-            <w:r>
+              <w:t>48</w:t>
+            </w:r>
+          </w:p>
+        </w:tc>
+        <w:tc>
+          <w:tcPr>
+            <w:tcW w:w="567" w:type="dxa"/>
+            <w:shd w:val="clear" w:color="auto" w:fill="C6D9F1" w:themeFill="text2" w:themeFillTint="33"/>
+            <w:vAlign w:val="center"/>
+            <w:hideMark/>
+          </w:tcPr>
+          <w:p>
+            <w:pPr>
+              <w:jc w:val="center"/>
               <w:rPr>
                 <w:b/>
                 <w:bCs/>
                 <w:sz w:val="16"/>
                 <w:szCs w:val="16"/>
               </w:rPr>
-              <w:t>8</w:t>
-            </w:r>
-          </w:p>
-        </w:tc>
-        <w:tc>
-          <w:tcPr>
-            <w:tcW w:w="567" w:type="dxa"/>
-            <w:shd w:val="clear" w:color="auto" w:fill="C6D9F1" w:themeFill="text2" w:themeFillTint="33"/>
-            <w:vAlign w:val="center"/>
-            <w:hideMark/>
-          </w:tcPr>
-          <w:p>
-            <w:pPr>
-              <w:jc w:val="center"/>
+            </w:pPr>
+            <w:r>
               <w:rPr>
                 <w:b/>
                 <w:bCs/>
                 <w:sz w:val="16"/>
                 <w:szCs w:val="16"/>
               </w:rPr>
-            </w:pPr>
-            <w:r>
-              <w:rPr>
-                <w:b/>
-                <w:bCs/>
-                <w:sz w:val="16"/>
-                <w:szCs w:val="16"/>
-              </w:rPr>
-              <w:t>4</w:t>
-            </w:r>
-            <w:r>
-              <w:rPr>
-                <w:b/>
-                <w:bCs/>
-                <w:sz w:val="16"/>
-                <w:szCs w:val="16"/>
-              </w:rPr>
-              <w:t>8</w:t>
+              <w:t>48</w:t>
             </w:r>
           </w:p>
         </w:tc>
@@ -3065,7 +3034,6 @@
                 <w:b w:val="0"/>
                 <w:bCs w:val="0"/>
               </w:rPr>
-              <w:lastRenderedPageBreak/>
               <w:t>N° historias técnicas (HT)</w:t>
             </w:r>
           </w:p>
@@ -3115,6 +3083,7 @@
                 <w:b w:val="0"/>
                 <w:bCs w:val="0"/>
               </w:rPr>
+              <w:lastRenderedPageBreak/>
               <w:t>N° ítems del backlog</w:t>
             </w:r>
           </w:p>
@@ -5187,6 +5156,7 @@
   <w:style w:type="character" w:default="1" w:styleId="Fuentedeprrafopredeter">
     <w:name w:val="Default Paragraph Font"/>
     <w:uiPriority w:val="1"/>
+    <w:semiHidden/>
     <w:unhideWhenUsed/>
   </w:style>
   <w:style w:type="table" w:default="1" w:styleId="Tablanormal">

</xml_diff>